<commit_message>
cập nhật 4. package diagram
</commit_message>
<xml_diff>
--- a/docs/4. Package Diagram.docx
+++ b/docs/4. Package Diagram.docx
@@ -735,14 +735,7 @@
           <w:b/>
           <w:bCs/>
         </w:rPr>
-        <w:t>Package</w:t>
-      </w:r>
-      <w:r>
-        <w:rPr>
-          <w:b/>
-          <w:bCs/>
-        </w:rPr>
-        <w:t xml:space="preserve"> </w:t>
+        <w:t xml:space="preserve">Package </w:t>
       </w:r>
       <w:r>
         <w:rPr>
@@ -758,10 +751,10 @@
           <w:noProof/>
         </w:rPr>
         <w:drawing>
-          <wp:inline distT="0" distB="0" distL="0" distR="0" wp14:anchorId="762803D9" wp14:editId="6AA2BC5A">
-            <wp:extent cx="5718927" cy="2659380"/>
-            <wp:effectExtent l="0" t="0" r="0" b="7620"/>
-            <wp:docPr id="73680616" name="Hình ảnh 1"/>
+          <wp:inline distT="0" distB="0" distL="0" distR="0" wp14:anchorId="59BD6F9B" wp14:editId="4899E783">
+            <wp:extent cx="5372100" cy="2668270"/>
+            <wp:effectExtent l="0" t="0" r="0" b="0"/>
+            <wp:docPr id="40693403" name="Hình ảnh 1"/>
             <wp:cNvGraphicFramePr>
               <a:graphicFrameLocks xmlns:a="http://schemas.openxmlformats.org/drawingml/2006/main" noChangeAspect="1"/>
             </wp:cNvGraphicFramePr>
@@ -769,7 +762,7 @@
               <a:graphicData uri="http://schemas.openxmlformats.org/drawingml/2006/picture">
                 <pic:pic xmlns:pic="http://schemas.openxmlformats.org/drawingml/2006/picture">
                   <pic:nvPicPr>
-                    <pic:cNvPr id="73680616" name=""/>
+                    <pic:cNvPr id="40693403" name=""/>
                     <pic:cNvPicPr/>
                   </pic:nvPicPr>
                   <pic:blipFill>
@@ -781,7 +774,7 @@
                   <pic:spPr>
                     <a:xfrm>
                       <a:off x="0" y="0"/>
-                      <a:ext cx="5809048" cy="2701287"/>
+                      <a:ext cx="5399588" cy="2681923"/>
                     </a:xfrm>
                     <a:prstGeom prst="rect">
                       <a:avLst/>
@@ -1565,6 +1558,7 @@
   <w:style w:type="character" w:default="1" w:styleId="Phngmcinhcuaoanvn">
     <w:name w:val="Default Paragraph Font"/>
     <w:uiPriority w:val="1"/>
+    <w:semiHidden/>
     <w:unhideWhenUsed/>
   </w:style>
   <w:style w:type="table" w:default="1" w:styleId="BangThngthng">

</xml_diff>